<commit_message>
Client Web 23 v1
</commit_message>
<xml_diff>
--- a/MurrayIrrigation/temp/MurrayIrrigation-Monthly-2025-08-31-Body.docx
+++ b/MurrayIrrigation/temp/MurrayIrrigation-Monthly-2025-08-31-Body.docx
@@ -394,7 +394,7 @@
           </w:tcPr>
           <w:p>
             <w:r>
-              <w:t>1.87</w:t>
+              <w:t>1.88</w:t>
             </w:r>
           </w:p>
         </w:tc>
@@ -1112,7 +1112,7 @@
           </w:tcPr>
           <w:p>
             <w:r>
-              <w:t>12.26</w:t>
+              <w:t>12.25</w:t>
             </w:r>
           </w:p>
         </w:tc>
@@ -1176,7 +1176,7 @@
           </w:tcPr>
           <w:p>
             <w:r>
-              <w:t>4.33</w:t>
+              <w:t>4.32</w:t>
             </w:r>
           </w:p>
         </w:tc>
@@ -1186,7 +1186,7 @@
           </w:tcPr>
           <w:p>
             <w:r>
-              <w:t>4.69</w:t>
+              <w:t>4.68</w:t>
             </w:r>
           </w:p>
         </w:tc>
@@ -1276,7 +1276,7 @@
       <w:r>
         <w:drawing>
           <wp:inline xmlns:a="http://schemas.openxmlformats.org/drawingml/2006/main" xmlns:pic="http://schemas.openxmlformats.org/drawingml/2006/picture">
-            <wp:extent cx="3240000" cy="2700000"/>
+            <wp:extent cx="3240000" cy="2322000"/>
             <wp:docPr id="4" name="Picture 4"/>
             <wp:cNvGraphicFramePr>
               <a:graphicFrameLocks noChangeAspect="1"/>
@@ -1297,7 +1297,7 @@
                   <pic:spPr>
                     <a:xfrm>
                       <a:off x="0" y="0"/>
-                      <a:ext cx="3240000" cy="2700000"/>
+                      <a:ext cx="3240000" cy="2322000"/>
                     </a:xfrm>
                     <a:prstGeom prst="rect"/>
                   </pic:spPr>
@@ -1757,7 +1757,7 @@
           </w:tcPr>
           <w:p>
             <w:r>
-              <w:t>3.53</w:t>
+              <w:t>3.51</w:t>
             </w:r>
           </w:p>
         </w:tc>
@@ -1767,7 +1767,7 @@
           </w:tcPr>
           <w:p>
             <w:r>
-              <w:t>4.07</w:t>
+              <w:t>4.06</w:t>
             </w:r>
           </w:p>
         </w:tc>

</xml_diff>